<commit_message>
Revise six reports to team voice and add Kovalenko as second named author
</commit_message>
<xml_diff>
--- a/lab01_representations/report.docx
+++ b/lab01_representations/report.docx
@@ -195,14 +195,27 @@
     <w:p>
       <w:pPr>
         <w:pStyle w:val="aff9"/>
-        <w:spacing w:before="1240" w:beforeAutospacing="0" w:after="0" w:afterAutospacing="0"/>
+        <w:spacing w:before="1040" w:beforeAutospacing="0" w:after="0" w:afterAutospacing="0"/>
         <w:jc w:val="both"/>
       </w:pPr>
       <w:r>
         <w:rPr>
           <w:sz w:val="28"/>
         </w:rPr>
-        <w:t>Обучающийся: Дущенко Даниил Александрович, К3341</w:t>
+        <w:t>Обучающиеся: Дущенко Даниил Александрович, К3341</w:t>
+      </w:r>
+    </w:p>
+    <w:p>
+      <w:pPr>
+        <w:pStyle w:val="aff9"/>
+        <w:spacing w:before="0" w:beforeAutospacing="0" w:after="0" w:afterAutospacing="0"/>
+        <w:jc w:val="both"/>
+      </w:pPr>
+      <w:r>
+        <w:rPr>
+          <w:sz w:val="28"/>
+        </w:rPr>
+        <w:t>Коваленко Евгений Юрьевич, К3341</w:t>
       </w:r>
     </w:p>
     <w:p>
@@ -283,7 +296,7 @@
       <w:r>
         <w:fldChar w:fldCharType="separate"/>
       </w:r>
-      <w:hyperlink w:anchor="_Toc239783893" w:history="1">
+      <w:hyperlink w:anchor="_Toc239790084" w:history="1">
         <w:r>
           <w:rPr>
             <w:rStyle w:val="aff8"/>
@@ -311,7 +324,7 @@
             <w:noProof/>
             <w:webHidden/>
           </w:rPr>
-          <w:instrText xml:space="preserve"> PAGEREF _Toc239783893 \h </w:instrText>
+          <w:instrText xml:space="preserve"> PAGEREF _Toc239790084 \h </w:instrText>
         </w:r>
         <w:r>
           <w:rPr>
@@ -356,7 +369,7 @@
           <w:lang w:val="ru-RU" w:eastAsia="ru-RU"/>
         </w:rPr>
       </w:pPr>
-      <w:hyperlink w:anchor="_Toc239783894" w:history="1">
+      <w:hyperlink w:anchor="_Toc239790085" w:history="1">
         <w:r>
           <w:rPr>
             <w:rStyle w:val="aff8"/>
@@ -384,7 +397,7 @@
             <w:noProof/>
             <w:webHidden/>
           </w:rPr>
-          <w:instrText xml:space="preserve"> PAGEREF _Toc239783894 \h </w:instrText>
+          <w:instrText xml:space="preserve"> PAGEREF _Toc239790085 \h </w:instrText>
         </w:r>
         <w:r>
           <w:rPr>
@@ -429,7 +442,7 @@
           <w:lang w:val="ru-RU" w:eastAsia="ru-RU"/>
         </w:rPr>
       </w:pPr>
-      <w:hyperlink w:anchor="_Toc239783895" w:history="1">
+      <w:hyperlink w:anchor="_Toc239790086" w:history="1">
         <w:r>
           <w:rPr>
             <w:rStyle w:val="aff8"/>
@@ -457,7 +470,7 @@
             <w:noProof/>
             <w:webHidden/>
           </w:rPr>
-          <w:instrText xml:space="preserve"> PAGEREF _Toc239783895 \h </w:instrText>
+          <w:instrText xml:space="preserve"> PAGEREF _Toc239790086 \h </w:instrText>
         </w:r>
         <w:r>
           <w:rPr>
@@ -502,7 +515,7 @@
           <w:lang w:val="ru-RU" w:eastAsia="ru-RU"/>
         </w:rPr>
       </w:pPr>
-      <w:hyperlink w:anchor="_Toc239783896" w:history="1">
+      <w:hyperlink w:anchor="_Toc239790087" w:history="1">
         <w:r>
           <w:rPr>
             <w:rStyle w:val="aff8"/>
@@ -530,7 +543,7 @@
             <w:noProof/>
             <w:webHidden/>
           </w:rPr>
-          <w:instrText xml:space="preserve"> PAGEREF _Toc239783896 \h </w:instrText>
+          <w:instrText xml:space="preserve"> PAGEREF _Toc239790087 \h </w:instrText>
         </w:r>
         <w:r>
           <w:rPr>
@@ -575,7 +588,7 @@
           <w:lang w:val="ru-RU" w:eastAsia="ru-RU"/>
         </w:rPr>
       </w:pPr>
-      <w:hyperlink w:anchor="_Toc239783897" w:history="1">
+      <w:hyperlink w:anchor="_Toc239790088" w:history="1">
         <w:r>
           <w:rPr>
             <w:rStyle w:val="aff8"/>
@@ -603,7 +616,7 @@
             <w:noProof/>
             <w:webHidden/>
           </w:rPr>
-          <w:instrText xml:space="preserve"> PAGEREF _Toc239783897 \h </w:instrText>
+          <w:instrText xml:space="preserve"> PAGEREF _Toc239790088 \h </w:instrText>
         </w:r>
         <w:r>
           <w:rPr>
@@ -648,7 +661,7 @@
           <w:lang w:val="ru-RU" w:eastAsia="ru-RU"/>
         </w:rPr>
       </w:pPr>
-      <w:hyperlink w:anchor="_Toc239783898" w:history="1">
+      <w:hyperlink w:anchor="_Toc239790089" w:history="1">
         <w:r>
           <w:rPr>
             <w:rStyle w:val="aff8"/>
@@ -676,7 +689,7 @@
             <w:noProof/>
             <w:webHidden/>
           </w:rPr>
-          <w:instrText xml:space="preserve"> PAGEREF _Toc239783898 \h </w:instrText>
+          <w:instrText xml:space="preserve"> PAGEREF _Toc239790089 \h </w:instrText>
         </w:r>
         <w:r>
           <w:rPr>
@@ -721,7 +734,7 @@
           <w:lang w:val="ru-RU" w:eastAsia="ru-RU"/>
         </w:rPr>
       </w:pPr>
-      <w:hyperlink w:anchor="_Toc239783899" w:history="1">
+      <w:hyperlink w:anchor="_Toc239790090" w:history="1">
         <w:r>
           <w:rPr>
             <w:rStyle w:val="aff8"/>
@@ -749,7 +762,7 @@
             <w:noProof/>
             <w:webHidden/>
           </w:rPr>
-          <w:instrText xml:space="preserve"> PAGEREF _Toc239783899 \h </w:instrText>
+          <w:instrText xml:space="preserve"> PAGEREF _Toc239790090 \h </w:instrText>
         </w:r>
         <w:r>
           <w:rPr>
@@ -794,7 +807,7 @@
           <w:lang w:val="ru-RU" w:eastAsia="ru-RU"/>
         </w:rPr>
       </w:pPr>
-      <w:hyperlink w:anchor="_Toc239783900" w:history="1">
+      <w:hyperlink w:anchor="_Toc239790091" w:history="1">
         <w:r>
           <w:rPr>
             <w:rStyle w:val="aff8"/>
@@ -822,7 +835,7 @@
             <w:noProof/>
             <w:webHidden/>
           </w:rPr>
-          <w:instrText xml:space="preserve"> PAGEREF _Toc239783900 \h </w:instrText>
+          <w:instrText xml:space="preserve"> PAGEREF _Toc239790091 \h </w:instrText>
         </w:r>
         <w:r>
           <w:rPr>
@@ -870,7 +883,7 @@
         <w:ind w:firstLine="0"/>
         <w:jc w:val="center"/>
       </w:pPr>
-      <w:bookmarkStart w:id="1" w:name="_Toc239783893"/>
+      <w:bookmarkStart w:id="1" w:name="_Toc239790084"/>
       <w:r>
         <w:lastRenderedPageBreak/>
         <w:t>ВВЕДЕНИЕ</w:t>
@@ -879,7 +892,13 @@
     </w:p>
     <w:p>
       <w:r>
-        <w:t>Цель работы — исследовать, какие свойства русскоязычного текста сохраняются при переходе к вычислительному представлению. Сходство векторов удобно для поиска похожих сообщений, но не тождественно совпадению смысла. Проверяются четыре представления: поверхностные признаки, bag-of-words, TF–IDF и sentence embeddings. Эксперимент построен на контролируемых преобразованиях: перестановке, парафразе и изменении смыслообразующего элемента. Численные результаты сопоставляются с заранее сформулированными семантическими суждениями.</w:t>
+        <w:t xml:space="preserve">В этой работе мы исследовали, </w:t>
+      </w:r>
+      <w:r>
+        <w:t>какие свойства русскоязычного текста сохраняются при переходе к вычислительному представлению. Сходство векторов удобно для поиска похожих сообщений, но не тождественно совпадению смысла. Мы сравнили четыре представления: поверхностные признаки, bag-of-wor</w:t>
+      </w:r>
+      <w:r>
+        <w:t>ds, TF–IDF и sentence embeddings. Эксперимент построен на контролируемых преобразованиях: перестановке, парафразе и изменении смыслообразующего элемента. Численные результаты сопоставляются с заранее сформулированными семантическими суждениями.</w:t>
       </w:r>
     </w:p>
     <w:p>
@@ -890,10 +909,13 @@
         <w:spacing w:after="240"/>
         <w:jc w:val="left"/>
       </w:pPr>
-      <w:bookmarkStart w:id="2" w:name="_Toc239783894"/>
+      <w:bookmarkStart w:id="2" w:name="_Toc239790085"/>
       <w:r>
         <w:lastRenderedPageBreak/>
-        <w:t>1 Выполнение работы</w:t>
+        <w:t xml:space="preserve">1 </w:t>
+      </w:r>
+      <w:r>
+        <w:t>Выполнение работы</w:t>
       </w:r>
       <w:bookmarkEnd w:id="2"/>
     </w:p>
@@ -904,7 +926,7 @@
         <w:spacing w:before="240" w:after="240"/>
         <w:jc w:val="left"/>
       </w:pPr>
-      <w:bookmarkStart w:id="3" w:name="_Toc239783895"/>
+      <w:bookmarkStart w:id="3" w:name="_Toc239790086"/>
       <w:r>
         <w:t>1.1 Данные и предварительная проверка</w:t>
       </w:r>
@@ -912,12 +934,21 @@
     </w:p>
     <w:p>
       <w:r>
-        <w:t>Использованы 150 сообщений RuSentiment [1]. Основной репозиторий больше не распространяет корпус, поэтому данные получены из публичного форка strawberrypie/rusentiment. Ссылка, контрольная сумма исходного файла и процедура отбора сохранены. Выборка взята из обучающей части общей подготовки с random_state=42; оставлены positive, negative и neutral. Классы speech и skip исключены. Это трёхклассовый учебный срез, а не воспроизведение исходной пяти-классовой задачи статьи.</w:t>
+        <w:t>Мы использовали 150 сообщений RuSentiment [1]. Основной репозиторий больше не распространяет корпус, поэтому данные получены из публичного форка strawberrypie/rusentiment. Ссылка, контрольная сумма ис</w:t>
+      </w:r>
+      <w:r>
+        <w:t>ходного файла и процедура отбора сохранены. Выборка взята из обучающей части общей подготовки с random_state=42; оставлены positive, negative и neutral. Классы speech и skip исключены. Это трёхклассовый учебный срез, а не воспроизведение исходной пяти-клас</w:t>
+      </w:r>
+      <w:r>
+        <w:t>совой задачи статьи.</w:t>
       </w:r>
     </w:p>
     <w:p>
       <w:r>
-        <w:t>В выборке 82 нейтральных, 46 положительных и 22 отрицательных сообщения. Пропусков и повторяющихся текстов после подготовки нет. В полном исходном файле случайных сообщений обнаружено 74 дубликата; удаление выполнено до отбора. Средняя длина равна 69,81 символа, медиана — 40,5, максимум — 789. Для токенов razdel среднее составляет 14,47, медиана — 9, максимум — 154. Разница среднего и медианы отражает длинный правый хвост: небольшое число длинных сообщений заметно влияет на среднее.</w:t>
+        <w:t>В выборке 82 нейтральных, 46 положительных и 22 отрицательных сообщения. Пропусков и повторяющихся текстов после подготовки нет. В полном исходном файле случайных сообщений обнаружено 74 дубликата; удаление выполнено до отбора. Средняя</w:t>
+      </w:r>
+      <w:r>
+        <w:t xml:space="preserve"> длина равна 69,81 символа, медиана — 40,5, максимум — 789. Для токенов razdel среднее составляет 14,47, медиана — 9, максимум — 154. Разница среднего и медианы отражает длинный правый хвост: небольшое число длинных сообщений заметно влияет на среднее.</w:t>
       </w:r>
     </w:p>
     <w:p>
@@ -973,7 +1004,10 @@
         <w:jc w:val="center"/>
       </w:pPr>
       <w:r>
-        <w:t>Рисунок 1 — Распределение длин текстов</w:t>
+        <w:t>Р</w:t>
+      </w:r>
+      <w:r>
+        <w:t>исунок 1 — Распределение длин текстов</w:t>
       </w:r>
     </w:p>
     <w:p>
@@ -983,7 +1017,7 @@
         <w:spacing w:before="240" w:after="240"/>
         <w:jc w:val="left"/>
       </w:pPr>
-      <w:bookmarkStart w:id="4" w:name="_Toc239783896"/>
+      <w:bookmarkStart w:id="4" w:name="_Toc239790087"/>
       <w:r>
         <w:t>1.2 Методика</w:t>
       </w:r>
@@ -995,22 +1029,43 @@
       </w:r>
       <w:r>
         <w:lastRenderedPageBreak/>
-        <w:t>заглавных букв среди букв. Такие признаки описывают форму сообщения и могут отражать эмоциональную подачу, но не указывают, о чём именно говорит автор. Например, два противоположных утверждения способны иметь почти одинаковую длину и пунктуацию. Все признаки сохранены построчно с исходными идентификаторами.</w:t>
+        <w:t>заглавных букв среди букв. Такие признаки описывают форму сообщения и могут</w:t>
+      </w:r>
+      <w:r>
+        <w:t xml:space="preserve"> отражать эмоциональную подачу, но не указывают, о чём именно говорит автор. Например, два противоположных утверждения способны иметь почти одинаковую длину и пунктуацию. Все признаки сохранены построчно с исходными идентификаторами.</w:t>
       </w:r>
     </w:p>
     <w:p>
       <w:r>
-        <w:t>Для bag-of-words и TF–IDF использованы CountVectorizer и TfidfVectorizer. Токенизация выполняется razdel, регистр понижается, чистая пунктуация исключается. Лемматизация и удаление стоп-слов не применяются: важно сохранить отрицание «не». Словарь и IDF обучаются только на 150 исходных текстах. Изменённые варианты преобразуются уже готовыми векторизаторами. Поэтому эксперимент также выявляет проблему неизвестных слов; доля OOV сохранена отдельно для каждой пары.</w:t>
+        <w:t>Для bag-of-words и TF–</w:t>
+      </w:r>
+      <w:r>
+        <w:t>IDF мы использовали CountVectorizer и TfidfVectorizer. Токенизация выполняется razdel, регистр понижается, чистая пунктуация исключается. Лемматизация и удаление стоп-слов не применяются: важно сохранить отрицание «не». Словарь и IDF обучаются только на 15</w:t>
+      </w:r>
+      <w:r>
+        <w:t>0 исходных текстах. Изменённые варианты преобразуются уже готовыми векторизаторами. Поэтому эксперимент также выявляет проблему неизвестных слов; доля OOV сохранена отдельно для каждой пары.</w:t>
       </w:r>
     </w:p>
     <w:p>
       <w:r>
-        <w:t>Плотное представление строится sentence-transformers с multilingual-e5-small [2]. Для симметричного сравнения обе стороны получают одинаковый префикс query:, векторы нормируются. Эмбеддинги вычислены на CPU, поэтому запуск работы не требует свободной видеокарты. Размерность и параметры модели записаны в embedding_config.json. Для каждого преобразования рассчитывается косинусное сходство с оригиналом; всего получено девять пар. Поверхностные признаки не включены в косинусное сравнение: задание требует его для трёх остальных представлений.</w:t>
+        <w:t>Плотное представление строится sentence-transformers с multilingu</w:t>
+      </w:r>
+      <w:r>
+        <w:t>al-e5-small [2]. Для симметричного сравнения обе стороны получают одинаковый префикс query:, векторы нормируются. Мы вычислили эмбеддинги на CPU, поэтому запуск работы не требует свободной видеокарты. Размерность и параметры модели записаны в embedding_con</w:t>
+      </w:r>
+      <w:r>
+        <w:t>fig.json. Для каждого преобразования мы рассчитали косинусное сходство с оригиналом; всего получено девять пар. Поверхностные признаки не включены в косинусное сравнение: задание требует его для трёх остальных представлений.</w:t>
       </w:r>
     </w:p>
     <w:p>
       <w:r>
-        <w:t>Выбраны оригиналы трёх классов: положительное сообщение о спокойной песне, отрицательное сообщение о глупых репостах и нейтральный вопрос о времени выезда. Семантические решения и обоснования зафиксированы ИИ-ассистентом при конструировании преобразований. Это аналитическая оценка, а не независимая человеческая разметка. Для парафраза вопроса сохраняется основное содержание, хотя эмоциональный оттенок обращения немного ослабляется.</w:t>
+        <w:t>Мы выбрали оригиналы трёх класс</w:t>
+      </w:r>
+      <w:r>
+        <w:t>ов: положительное сообщение о спокойной песне, отрицательное сообщение о глупых репостах и нейтральный вопрос о времени выезда. При конструировании преобразований мы заранее сформулировали семантические решения и обоснования, чтобы затем сопоставить их с ч</w:t>
+      </w:r>
+      <w:r>
+        <w:t>исленным сходством. Для парафраза вопроса сохраняется основное содержание, хотя эмоциональный оттенок обращения немного ослабляется.</w:t>
       </w:r>
     </w:p>
     <w:p>
@@ -1020,7 +1075,7 @@
         <w:spacing w:before="240" w:after="240"/>
         <w:jc w:val="left"/>
       </w:pPr>
-      <w:bookmarkStart w:id="5" w:name="_Toc239783897"/>
+      <w:bookmarkStart w:id="5" w:name="_Toc239790088"/>
       <w:r>
         <w:lastRenderedPageBreak/>
         <w:t>1.3 Результаты девяти сравнений</w:t>
@@ -1061,6 +1116,7 @@
           </w:tcPr>
           <w:p>
             <w:pPr>
+              <w:keepNext/>
               <w:spacing w:before="60" w:after="60" w:line="240" w:lineRule="auto"/>
               <w:ind w:firstLine="0"/>
             </w:pPr>
@@ -1079,6 +1135,7 @@
           </w:tcPr>
           <w:p>
             <w:pPr>
+              <w:keepNext/>
               <w:spacing w:before="60" w:after="60" w:line="240" w:lineRule="auto"/>
               <w:ind w:firstLine="0"/>
             </w:pPr>
@@ -1097,6 +1154,7 @@
           </w:tcPr>
           <w:p>
             <w:pPr>
+              <w:keepNext/>
               <w:spacing w:before="60" w:after="60" w:line="240" w:lineRule="auto"/>
               <w:ind w:firstLine="0"/>
             </w:pPr>
@@ -1115,6 +1173,7 @@
           </w:tcPr>
           <w:p>
             <w:pPr>
+              <w:keepNext/>
               <w:spacing w:before="60" w:after="60" w:line="240" w:lineRule="auto"/>
               <w:ind w:firstLine="0"/>
             </w:pPr>
@@ -1138,6 +1197,7 @@
           </w:tcPr>
           <w:p>
             <w:pPr>
+              <w:keepNext/>
               <w:spacing w:before="60" w:after="60" w:line="240" w:lineRule="auto"/>
               <w:ind w:firstLine="0"/>
             </w:pPr>
@@ -1145,7 +1205,13 @@
               <w:rPr>
                 <w:sz w:val="24"/>
               </w:rPr>
-              <w:t>Positive: перестановка</w:t>
+              <w:t xml:space="preserve">Positive: </w:t>
+            </w:r>
+            <w:r>
+              <w:rPr>
+                <w:sz w:val="24"/>
+              </w:rPr>
+              <w:t>перестановка</w:t>
             </w:r>
           </w:p>
         </w:tc>
@@ -1155,6 +1221,7 @@
           </w:tcPr>
           <w:p>
             <w:pPr>
+              <w:keepNext/>
               <w:spacing w:before="60" w:after="60" w:line="240" w:lineRule="auto"/>
               <w:ind w:firstLine="0"/>
             </w:pPr>
@@ -1172,6 +1239,7 @@
           </w:tcPr>
           <w:p>
             <w:pPr>
+              <w:keepNext/>
               <w:spacing w:before="60" w:after="60" w:line="240" w:lineRule="auto"/>
               <w:ind w:firstLine="0"/>
             </w:pPr>
@@ -1189,6 +1257,7 @@
           </w:tcPr>
           <w:p>
             <w:pPr>
+              <w:keepNext/>
               <w:spacing w:before="60" w:after="60" w:line="240" w:lineRule="auto"/>
               <w:ind w:firstLine="0"/>
             </w:pPr>
@@ -1211,6 +1280,7 @@
           </w:tcPr>
           <w:p>
             <w:pPr>
+              <w:keepNext/>
               <w:spacing w:before="60" w:after="60" w:line="240" w:lineRule="auto"/>
               <w:ind w:firstLine="0"/>
             </w:pPr>
@@ -1228,6 +1298,7 @@
           </w:tcPr>
           <w:p>
             <w:pPr>
+              <w:keepNext/>
               <w:spacing w:before="60" w:after="60" w:line="240" w:lineRule="auto"/>
               <w:ind w:firstLine="0"/>
             </w:pPr>
@@ -1245,6 +1316,7 @@
           </w:tcPr>
           <w:p>
             <w:pPr>
+              <w:keepNext/>
               <w:spacing w:before="60" w:after="60" w:line="240" w:lineRule="auto"/>
               <w:ind w:firstLine="0"/>
             </w:pPr>
@@ -1262,6 +1334,7 @@
           </w:tcPr>
           <w:p>
             <w:pPr>
+              <w:keepNext/>
               <w:spacing w:before="60" w:after="60" w:line="240" w:lineRule="auto"/>
               <w:ind w:firstLine="0"/>
             </w:pPr>
@@ -1284,6 +1357,7 @@
           </w:tcPr>
           <w:p>
             <w:pPr>
+              <w:keepNext/>
               <w:spacing w:before="60" w:after="60" w:line="240" w:lineRule="auto"/>
               <w:ind w:firstLine="0"/>
             </w:pPr>
@@ -1301,6 +1375,7 @@
           </w:tcPr>
           <w:p>
             <w:pPr>
+              <w:keepNext/>
               <w:spacing w:before="60" w:after="60" w:line="240" w:lineRule="auto"/>
               <w:ind w:firstLine="0"/>
             </w:pPr>
@@ -1318,6 +1393,7 @@
           </w:tcPr>
           <w:p>
             <w:pPr>
+              <w:keepNext/>
               <w:spacing w:before="60" w:after="60" w:line="240" w:lineRule="auto"/>
               <w:ind w:firstLine="0"/>
             </w:pPr>
@@ -1335,6 +1411,7 @@
           </w:tcPr>
           <w:p>
             <w:pPr>
+              <w:keepNext/>
               <w:spacing w:before="60" w:after="60" w:line="240" w:lineRule="auto"/>
               <w:ind w:firstLine="0"/>
             </w:pPr>
@@ -1357,6 +1434,7 @@
           </w:tcPr>
           <w:p>
             <w:pPr>
+              <w:keepNext/>
               <w:spacing w:before="60" w:after="60" w:line="240" w:lineRule="auto"/>
               <w:ind w:firstLine="0"/>
             </w:pPr>
@@ -1374,6 +1452,7 @@
           </w:tcPr>
           <w:p>
             <w:pPr>
+              <w:keepNext/>
               <w:spacing w:before="60" w:after="60" w:line="240" w:lineRule="auto"/>
               <w:ind w:firstLine="0"/>
             </w:pPr>
@@ -1391,6 +1470,7 @@
           </w:tcPr>
           <w:p>
             <w:pPr>
+              <w:keepNext/>
               <w:spacing w:before="60" w:after="60" w:line="240" w:lineRule="auto"/>
               <w:ind w:firstLine="0"/>
             </w:pPr>
@@ -1408,6 +1488,7 @@
           </w:tcPr>
           <w:p>
             <w:pPr>
+              <w:keepNext/>
               <w:spacing w:before="60" w:after="60" w:line="240" w:lineRule="auto"/>
               <w:ind w:firstLine="0"/>
             </w:pPr>
@@ -1430,6 +1511,7 @@
           </w:tcPr>
           <w:p>
             <w:pPr>
+              <w:keepNext/>
               <w:spacing w:before="60" w:after="60" w:line="240" w:lineRule="auto"/>
               <w:ind w:firstLine="0"/>
             </w:pPr>
@@ -1447,6 +1529,7 @@
           </w:tcPr>
           <w:p>
             <w:pPr>
+              <w:keepNext/>
               <w:spacing w:before="60" w:after="60" w:line="240" w:lineRule="auto"/>
               <w:ind w:firstLine="0"/>
             </w:pPr>
@@ -1464,6 +1547,7 @@
           </w:tcPr>
           <w:p>
             <w:pPr>
+              <w:keepNext/>
               <w:spacing w:before="60" w:after="60" w:line="240" w:lineRule="auto"/>
               <w:ind w:firstLine="0"/>
             </w:pPr>
@@ -1481,6 +1565,7 @@
           </w:tcPr>
           <w:p>
             <w:pPr>
+              <w:keepNext/>
               <w:spacing w:before="60" w:after="60" w:line="240" w:lineRule="auto"/>
               <w:ind w:firstLine="0"/>
             </w:pPr>
@@ -1503,6 +1588,7 @@
           </w:tcPr>
           <w:p>
             <w:pPr>
+              <w:keepNext/>
               <w:spacing w:before="60" w:after="60" w:line="240" w:lineRule="auto"/>
               <w:ind w:firstLine="0"/>
             </w:pPr>
@@ -1520,6 +1606,7 @@
           </w:tcPr>
           <w:p>
             <w:pPr>
+              <w:keepNext/>
               <w:spacing w:before="60" w:after="60" w:line="240" w:lineRule="auto"/>
               <w:ind w:firstLine="0"/>
             </w:pPr>
@@ -1537,6 +1624,7 @@
           </w:tcPr>
           <w:p>
             <w:pPr>
+              <w:keepNext/>
               <w:spacing w:before="60" w:after="60" w:line="240" w:lineRule="auto"/>
               <w:ind w:firstLine="0"/>
             </w:pPr>
@@ -1554,6 +1642,7 @@
           </w:tcPr>
           <w:p>
             <w:pPr>
+              <w:keepNext/>
               <w:spacing w:before="60" w:after="60" w:line="240" w:lineRule="auto"/>
               <w:ind w:firstLine="0"/>
             </w:pPr>
@@ -1576,6 +1665,7 @@
           </w:tcPr>
           <w:p>
             <w:pPr>
+              <w:keepNext/>
               <w:spacing w:before="60" w:after="60" w:line="240" w:lineRule="auto"/>
               <w:ind w:firstLine="0"/>
             </w:pPr>
@@ -1583,7 +1673,13 @@
               <w:rPr>
                 <w:sz w:val="24"/>
               </w:rPr>
-              <w:t>Neutral: перестановка</w:t>
+              <w:t xml:space="preserve">Neutral: </w:t>
+            </w:r>
+            <w:r>
+              <w:rPr>
+                <w:sz w:val="24"/>
+              </w:rPr>
+              <w:t>перестановка</w:t>
             </w:r>
           </w:p>
         </w:tc>
@@ -1593,6 +1689,7 @@
           </w:tcPr>
           <w:p>
             <w:pPr>
+              <w:keepNext/>
               <w:spacing w:before="60" w:after="60" w:line="240" w:lineRule="auto"/>
               <w:ind w:firstLine="0"/>
             </w:pPr>
@@ -1610,6 +1707,7 @@
           </w:tcPr>
           <w:p>
             <w:pPr>
+              <w:keepNext/>
               <w:spacing w:before="60" w:after="60" w:line="240" w:lineRule="auto"/>
               <w:ind w:firstLine="0"/>
             </w:pPr>
@@ -1627,6 +1725,7 @@
           </w:tcPr>
           <w:p>
             <w:pPr>
+              <w:keepNext/>
               <w:spacing w:before="60" w:after="60" w:line="240" w:lineRule="auto"/>
               <w:ind w:firstLine="0"/>
             </w:pPr>
@@ -1649,6 +1748,7 @@
           </w:tcPr>
           <w:p>
             <w:pPr>
+              <w:keepNext/>
               <w:spacing w:before="60" w:after="60" w:line="240" w:lineRule="auto"/>
               <w:ind w:firstLine="0"/>
             </w:pPr>
@@ -1666,6 +1766,7 @@
           </w:tcPr>
           <w:p>
             <w:pPr>
+              <w:keepNext/>
               <w:spacing w:before="60" w:after="60" w:line="240" w:lineRule="auto"/>
               <w:ind w:firstLine="0"/>
             </w:pPr>
@@ -1683,6 +1784,7 @@
           </w:tcPr>
           <w:p>
             <w:pPr>
+              <w:keepNext/>
               <w:spacing w:before="60" w:after="60" w:line="240" w:lineRule="auto"/>
               <w:ind w:firstLine="0"/>
             </w:pPr>
@@ -1700,6 +1802,7 @@
           </w:tcPr>
           <w:p>
             <w:pPr>
+              <w:keepNext/>
               <w:spacing w:before="60" w:after="60" w:line="240" w:lineRule="auto"/>
               <w:ind w:firstLine="0"/>
             </w:pPr>
@@ -1850,11 +1953,17 @@
     </w:p>
     <w:p>
       <w:r>
-        <w:t xml:space="preserve">Перестановка не меняет unigram-счётчики, поэтому обе разреженные модели возвращают ровно единицу. Этот результат следует из определения представления, а не доказывает языковое понимание. Эмбеддинги немного меняются, поскольку модель чувствительна к последовательности. Для </w:t>
+        <w:t xml:space="preserve">Перестановка не меняет unigram-счётчики, поэтому обе разреженные модели возвращают ровно </w:t>
+      </w:r>
+      <w:r>
+        <w:t xml:space="preserve">единицу. Этот результат следует из определения представления, а не доказывает языковое понимание. Эмбеддинги немного меняются, поскольку модель чувствительна к последовательности. Для </w:t>
       </w:r>
       <w:r>
         <w:lastRenderedPageBreak/>
-        <w:t>парафразов плотное представление существенно лучше сохраняет близость: значения 0,892–0,930 против 0–0,577 у разреженных методов. Однако часть падения BoW объясняется малым словарём и морфологическими различиями, а не только заменой смысла.</w:t>
+        <w:t>парафразов плотное представление существенно лучше сохраняет близость: з</w:t>
+      </w:r>
+      <w:r>
+        <w:t>начения 0,892–0,930 против 0–0,577 у разреженных методов. Однако часть падения BoW объясняется малым словарём и морфологическими различиями, а не только заменой смысла.</w:t>
       </w:r>
     </w:p>
     <w:p>
@@ -1864,7 +1973,7 @@
         <w:spacing w:before="240" w:after="240"/>
         <w:jc w:val="left"/>
       </w:pPr>
-      <w:bookmarkStart w:id="6" w:name="_Toc239783898"/>
+      <w:bookmarkStart w:id="6" w:name="_Toc239790089"/>
       <w:r>
         <w:t>1.4 Три несоответствия близости и смысла</w:t>
       </w:r>
@@ -1872,17 +1981,32 @@
     </w:p>
     <w:p>
       <w:r>
-        <w:t>Первый случай: «Обожаю её» заменено на «Не обожаю её». Утверждение о восхищении отрицается, но TF–IDF даёт 0,974 и E5 — 0,974. Почти весь словарь и тема песни сохранены; частое короткое отрицание мало меняет направление вектора. При этом новая фраза не обязательно означает ненависть: корректный вывод ограничен отсутствием прежнего утверждения.</w:t>
+        <w:t>Первый случай: «Обожаю её» заменено на «Не обо</w:t>
+      </w:r>
+      <w:r>
+        <w:t xml:space="preserve">жаю её». Утверждение о восхищении отрицается, но TF–IDF даёт 0,974 и E5 — 0,974. Почти весь словарь и тема песни сохранены; частое короткое отрицание мало меняет направление вектора. При этом новая фраза не обязательно означает ненависть: корректный вывод </w:t>
+      </w:r>
+      <w:r>
+        <w:t>ограничен отсутствием прежнего утверждения.</w:t>
       </w:r>
     </w:p>
     <w:p>
       <w:r>
-        <w:t>Второй случай: «у тебя одни глупые репосты» превращается в «у тебя не одни глупые репосты». Меняется область отрицания и всеобщность оценки: допускаются другие публикации. BoW остаётся равным 0,943, TF–IDF — 0,979, E5 — 0,987. Плотная модель в этой паре даже менее чувствительна, чем простое счётное представление. Тематическая близость не позволяет восстановить логический квантор.</w:t>
+        <w:t>Второй случай: «у тебя одни глупые репосты» превращается в «у тебя не одни глупые репосты». Меняется область отрицания и всеобщность оценки: допускаются другие публикации. BoW остаётся равным 0,943, TF–IDF — 0,97</w:t>
+      </w:r>
+      <w:r>
+        <w:t>9, E5 — 0,987. Плотная модель в этой паре даже менее чувствительна, чем простое счётное представление. Тематическая близость не позволяет восстановить логический квантор.</w:t>
       </w:r>
     </w:p>
     <w:p>
       <w:r>
-        <w:t>Третий случай: «Когда выезжаешь» заменено на «Когда приезжаешь». Оба сообщения относятся к поездке, но запрашивают разные события и обычно разные моменты времени. E5 показывает 0,988 — больше, чем для смыслосохраняющего парафраза этого же вопроса. Разреженные методы замечают замену слова сильнее, однако сами не объясняют различие выезда и прибытия. Следовательно, универсальный порог сходства не решает задачу эквивалентности.</w:t>
+        <w:t>Третий случай: «Когда выезжаешь» заменено на «Когда приезжаешь». Оба сообщения относя</w:t>
+      </w:r>
+      <w:r>
+        <w:t xml:space="preserve">тся к поездке, но запрашивают разные события и обычно разные моменты времени. E5 показывает 0,988 — больше, чем для смыслосохраняющего парафраза этого же вопроса. Разреженные методы замечают замену слова сильнее, однако сами не объясняют различие выезда и </w:t>
+      </w:r>
+      <w:r>
+        <w:t>прибытия. Следовательно, универсальный порог сходства не решает задачу эквивалентности.</w:t>
       </w:r>
     </w:p>
     <w:p>
@@ -1894,7 +2018,7 @@
         <w:ind w:firstLine="0"/>
         <w:jc w:val="center"/>
       </w:pPr>
-      <w:bookmarkStart w:id="7" w:name="_Toc239783899"/>
+      <w:bookmarkStart w:id="7" w:name="_Toc239790090"/>
       <w:r>
         <w:lastRenderedPageBreak/>
         <w:t>ЗАКЛЮЧЕНИЕ</w:t>
@@ -1903,7 +2027,13 @@
     </w:p>
     <w:p>
       <w:r>
-        <w:t>Поверхностные признаки сохраняют форму, BoW — лексический состав, TF–IDF — взвешенный лексический состав, E5 — более широкую тематическую и семантическую близость. Плотные векторы полезнее для перефразирования, но могут игнорировать отрицание и замену события. Девять специально выбранных пар иллюстрируют механизм ошибки, а не оценивают её частоту в языке. Для задач, где важны противоположные утверждения, после поиска похожих текстов необходима отдельная проверка содержания. Notebook выполнен последовательно; исходные данные, преобразования, матрицы, графики и таблицы сохранены для повторного запуска.</w:t>
+        <w:t>Поверхностные признаки сохраняют форму, BoW — лексический состав, TF–IDF — взвешенный лексический состав, E5 — более широкую тематическую и семантическую бли</w:t>
+      </w:r>
+      <w:r>
+        <w:t>зость. Плотные векторы полезнее для перефразирования, но могут игнорировать отрицание и замену события. Девять специально выбранных пар иллюстрируют механизм ошибки, а не оценивают её частоту в языке. Для задач, где важны противоположные утверждения, после</w:t>
+      </w:r>
+      <w:r>
+        <w:t xml:space="preserve"> поиска похожих текстов необходима отдельная проверка содержания. Мы последовательно выполнили notebook; исходные данные, преобразования, матрицы, графики и таблицы сохранены для повторного запуска.</w:t>
       </w:r>
     </w:p>
     <w:p>
@@ -1915,7 +2045,7 @@
         <w:ind w:firstLine="0"/>
         <w:jc w:val="center"/>
       </w:pPr>
-      <w:bookmarkStart w:id="8" w:name="_Toc239783900"/>
+      <w:bookmarkStart w:id="8" w:name="_Toc239790091"/>
       <w:r>
         <w:lastRenderedPageBreak/>
         <w:t>СПИСОК ИСПОЛЬЗОВАННЫХ ИСТОЧНИКОВ</w:t>
@@ -1924,12 +2054,18 @@
     </w:p>
     <w:p>
       <w:r>
-        <w:t>[1] Rogers A. et al. RuSentiment: An Enriched Sentiment Analysis Dataset for Social Media in Russian. COLING, 2018. URL: https://aclanthology.org/C18-1064/ (дата обращения: 08.09.2026). Данные: https://github.com/strawberrypie/rusentiment.</w:t>
+        <w:t>[1] Rogers A. et al. RuS</w:t>
+      </w:r>
+      <w:r>
+        <w:t>entiment: An Enriched Sentiment Analysis Dataset for Social Media in Russian. COLING, 2018. URL: https://aclanthology.org/C18-1064/ (дата обращения: 08.09.2026). Данные: https://github.com/strawberrypie/rusentiment.</w:t>
       </w:r>
     </w:p>
     <w:p>
       <w:r>
-        <w:t>[2] intfloat. Multilingual E5 small: model card. URL: https://huggingface.co/intfloat/multilingual-e5-small (дата обращения: 08.09.2026).</w:t>
+        <w:t>[2] intfloat. Multilingual E5 small: mod</w:t>
+      </w:r>
+      <w:r>
+        <w:t>el card. URL: https://huggingface.co/intfloat/multilingual-e5-small (дата обращения: 08.09.2026).</w:t>
       </w:r>
     </w:p>
     <w:sectPr>
@@ -2398,7 +2534,7 @@
     <w:lsdException w:name="Table Web 2" w:semiHidden="1" w:unhideWhenUsed="1"/>
     <w:lsdException w:name="Table Web 3" w:semiHidden="1" w:unhideWhenUsed="1"/>
     <w:lsdException w:name="Balloon Text" w:semiHidden="1" w:unhideWhenUsed="1"/>
-    <w:lsdException w:name="Table Grid" w:uiPriority="59"/>
+    <w:lsdException w:name="Table Grid" w:semiHidden="1" w:uiPriority="59" w:unhideWhenUsed="1"/>
     <w:lsdException w:name="Table Theme" w:semiHidden="1" w:unhideWhenUsed="1"/>
     <w:lsdException w:name="Placeholder Text" w:semiHidden="1"/>
     <w:lsdException w:name="No Spacing" w:uiPriority="1" w:qFormat="1"/>
@@ -13989,7 +14125,7 @@
 </file>
 
 <file path=customXml/itemProps1.xml><?xml version="1.0" encoding="utf-8"?>
-<ds:datastoreItem xmlns:ds="http://schemas.openxmlformats.org/officeDocument/2006/customXml" ds:itemID="{AA65CF83-645A-4D18-98B5-F4B3754BDF1B}">
+<ds:datastoreItem xmlns:ds="http://schemas.openxmlformats.org/officeDocument/2006/customXml" ds:itemID="{37525F05-8562-463B-A3E5-0CE62F3DF254}">
   <ds:schemaRefs>
     <ds:schemaRef ds:uri="http://schemas.openxmlformats.org/officeDocument/2006/bibliography"/>
   </ds:schemaRefs>

</xml_diff>

<commit_message>
Make labs 1, 3 and 4 individual reports for Dushchenko
</commit_message>
<xml_diff>
--- a/lab01_representations/report.docx
+++ b/lab01_representations/report.docx
@@ -195,27 +195,14 @@
     <w:p>
       <w:pPr>
         <w:pStyle w:val="aff9"/>
-        <w:spacing w:before="1040" w:beforeAutospacing="0" w:after="0" w:afterAutospacing="0"/>
+        <w:spacing w:before="1240" w:beforeAutospacing="0" w:after="0" w:afterAutospacing="0"/>
         <w:jc w:val="both"/>
       </w:pPr>
       <w:r>
         <w:rPr>
           <w:sz w:val="28"/>
         </w:rPr>
-        <w:t>Обучающиеся: Дущенко Даниил Александрович, К3341</w:t>
-      </w:r>
-    </w:p>
-    <w:p>
-      <w:pPr>
-        <w:pStyle w:val="aff9"/>
-        <w:spacing w:before="0" w:beforeAutospacing="0" w:after="0" w:afterAutospacing="0"/>
-        <w:jc w:val="both"/>
-      </w:pPr>
-      <w:r>
-        <w:rPr>
-          <w:sz w:val="28"/>
-        </w:rPr>
-        <w:t>Коваленко Евгений Юрьевич, К3341</w:t>
+        <w:t>Обучающийся: Дущенко Даниил Александрович, К3341</w:t>
       </w:r>
     </w:p>
     <w:p>
@@ -296,7 +283,7 @@
       <w:r>
         <w:fldChar w:fldCharType="separate"/>
       </w:r>
-      <w:hyperlink w:anchor="_Toc239790084" w:history="1">
+      <w:hyperlink w:anchor="_Toc239790555" w:history="1">
         <w:r>
           <w:rPr>
             <w:rStyle w:val="aff8"/>
@@ -324,7 +311,7 @@
             <w:noProof/>
             <w:webHidden/>
           </w:rPr>
-          <w:instrText xml:space="preserve"> PAGEREF _Toc239790084 \h </w:instrText>
+          <w:instrText xml:space="preserve"> PAGEREF _Toc239790555 \h </w:instrText>
         </w:r>
         <w:r>
           <w:rPr>
@@ -369,7 +356,7 @@
           <w:lang w:val="ru-RU" w:eastAsia="ru-RU"/>
         </w:rPr>
       </w:pPr>
-      <w:hyperlink w:anchor="_Toc239790085" w:history="1">
+      <w:hyperlink w:anchor="_Toc239790556" w:history="1">
         <w:r>
           <w:rPr>
             <w:rStyle w:val="aff8"/>
@@ -397,7 +384,7 @@
             <w:noProof/>
             <w:webHidden/>
           </w:rPr>
-          <w:instrText xml:space="preserve"> PAGEREF _Toc239790085 \h </w:instrText>
+          <w:instrText xml:space="preserve"> PAGEREF _Toc239790556 \h </w:instrText>
         </w:r>
         <w:r>
           <w:rPr>
@@ -442,7 +429,7 @@
           <w:lang w:val="ru-RU" w:eastAsia="ru-RU"/>
         </w:rPr>
       </w:pPr>
-      <w:hyperlink w:anchor="_Toc239790086" w:history="1">
+      <w:hyperlink w:anchor="_Toc239790557" w:history="1">
         <w:r>
           <w:rPr>
             <w:rStyle w:val="aff8"/>
@@ -470,7 +457,7 @@
             <w:noProof/>
             <w:webHidden/>
           </w:rPr>
-          <w:instrText xml:space="preserve"> PAGEREF _Toc239790086 \h </w:instrText>
+          <w:instrText xml:space="preserve"> PAGEREF _Toc239790557 \h </w:instrText>
         </w:r>
         <w:r>
           <w:rPr>
@@ -515,7 +502,7 @@
           <w:lang w:val="ru-RU" w:eastAsia="ru-RU"/>
         </w:rPr>
       </w:pPr>
-      <w:hyperlink w:anchor="_Toc239790087" w:history="1">
+      <w:hyperlink w:anchor="_Toc239790558" w:history="1">
         <w:r>
           <w:rPr>
             <w:rStyle w:val="aff8"/>
@@ -543,7 +530,7 @@
             <w:noProof/>
             <w:webHidden/>
           </w:rPr>
-          <w:instrText xml:space="preserve"> PAGEREF _Toc239790087 \h </w:instrText>
+          <w:instrText xml:space="preserve"> PAGEREF _Toc239790558 \h </w:instrText>
         </w:r>
         <w:r>
           <w:rPr>
@@ -588,7 +575,7 @@
           <w:lang w:val="ru-RU" w:eastAsia="ru-RU"/>
         </w:rPr>
       </w:pPr>
-      <w:hyperlink w:anchor="_Toc239790088" w:history="1">
+      <w:hyperlink w:anchor="_Toc239790559" w:history="1">
         <w:r>
           <w:rPr>
             <w:rStyle w:val="aff8"/>
@@ -616,7 +603,7 @@
             <w:noProof/>
             <w:webHidden/>
           </w:rPr>
-          <w:instrText xml:space="preserve"> PAGEREF _Toc239790088 \h </w:instrText>
+          <w:instrText xml:space="preserve"> PAGEREF _Toc239790559 \h </w:instrText>
         </w:r>
         <w:r>
           <w:rPr>
@@ -661,7 +648,7 @@
           <w:lang w:val="ru-RU" w:eastAsia="ru-RU"/>
         </w:rPr>
       </w:pPr>
-      <w:hyperlink w:anchor="_Toc239790089" w:history="1">
+      <w:hyperlink w:anchor="_Toc239790560" w:history="1">
         <w:r>
           <w:rPr>
             <w:rStyle w:val="aff8"/>
@@ -689,7 +676,7 @@
             <w:noProof/>
             <w:webHidden/>
           </w:rPr>
-          <w:instrText xml:space="preserve"> PAGEREF _Toc239790089 \h </w:instrText>
+          <w:instrText xml:space="preserve"> PAGEREF _Toc239790560 \h </w:instrText>
         </w:r>
         <w:r>
           <w:rPr>
@@ -734,7 +721,7 @@
           <w:lang w:val="ru-RU" w:eastAsia="ru-RU"/>
         </w:rPr>
       </w:pPr>
-      <w:hyperlink w:anchor="_Toc239790090" w:history="1">
+      <w:hyperlink w:anchor="_Toc239790561" w:history="1">
         <w:r>
           <w:rPr>
             <w:rStyle w:val="aff8"/>
@@ -762,7 +749,7 @@
             <w:noProof/>
             <w:webHidden/>
           </w:rPr>
-          <w:instrText xml:space="preserve"> PAGEREF _Toc239790090 \h </w:instrText>
+          <w:instrText xml:space="preserve"> PAGEREF _Toc239790561 \h </w:instrText>
         </w:r>
         <w:r>
           <w:rPr>
@@ -807,7 +794,7 @@
           <w:lang w:val="ru-RU" w:eastAsia="ru-RU"/>
         </w:rPr>
       </w:pPr>
-      <w:hyperlink w:anchor="_Toc239790091" w:history="1">
+      <w:hyperlink w:anchor="_Toc239790562" w:history="1">
         <w:r>
           <w:rPr>
             <w:rStyle w:val="aff8"/>
@@ -835,7 +822,7 @@
             <w:noProof/>
             <w:webHidden/>
           </w:rPr>
-          <w:instrText xml:space="preserve"> PAGEREF _Toc239790091 \h </w:instrText>
+          <w:instrText xml:space="preserve"> PAGEREF _Toc239790562 \h </w:instrText>
         </w:r>
         <w:r>
           <w:rPr>
@@ -883,7 +870,7 @@
         <w:ind w:firstLine="0"/>
         <w:jc w:val="center"/>
       </w:pPr>
-      <w:bookmarkStart w:id="1" w:name="_Toc239790084"/>
+      <w:bookmarkStart w:id="1" w:name="_Toc239790555"/>
       <w:r>
         <w:lastRenderedPageBreak/>
         <w:t>ВВЕДЕНИЕ</w:t>
@@ -892,13 +879,13 @@
     </w:p>
     <w:p>
       <w:r>
-        <w:t xml:space="preserve">В этой работе мы исследовали, </w:t>
+        <w:t xml:space="preserve">В этой работе я исследовал, какие свойства русскоязычного текста </w:t>
       </w:r>
       <w:r>
-        <w:t>какие свойства русскоязычного текста сохраняются при переходе к вычислительному представлению. Сходство векторов удобно для поиска похожих сообщений, но не тождественно совпадению смысла. Мы сравнили четыре представления: поверхностные признаки, bag-of-wor</w:t>
+        <w:t>сохраняются при переходе к вычислительному представлению. Сходство векторов удобно для поиска похожих сообщений, но не тождественно совпадению смысла. Я сравнил четыре представления: поверхностные признаки, bag-of-words, TF–IDF и sentence embeddings. Экспе</w:t>
       </w:r>
       <w:r>
-        <w:t>ds, TF–IDF и sentence embeddings. Эксперимент построен на контролируемых преобразованиях: перестановке, парафразе и изменении смыслообразующего элемента. Численные результаты сопоставляются с заранее сформулированными семантическими суждениями.</w:t>
+        <w:t>римент построен на контролируемых преобразованиях: перестановке, парафразе и изменении смыслообразующего элемента. Численные результаты сопоставляются с заранее сформулированными семантическими суждениями.</w:t>
       </w:r>
     </w:p>
     <w:p>
@@ -909,13 +896,10 @@
         <w:spacing w:after="240"/>
         <w:jc w:val="left"/>
       </w:pPr>
-      <w:bookmarkStart w:id="2" w:name="_Toc239790085"/>
+      <w:bookmarkStart w:id="2" w:name="_Toc239790556"/>
       <w:r>
         <w:lastRenderedPageBreak/>
-        <w:t xml:space="preserve">1 </w:t>
-      </w:r>
-      <w:r>
-        <w:t>Выполнение работы</w:t>
+        <w:t>1 Выполнение работы</w:t>
       </w:r>
       <w:bookmarkEnd w:id="2"/>
     </w:p>
@@ -926,29 +910,32 @@
         <w:spacing w:before="240" w:after="240"/>
         <w:jc w:val="left"/>
       </w:pPr>
-      <w:bookmarkStart w:id="3" w:name="_Toc239790086"/>
+      <w:bookmarkStart w:id="3" w:name="_Toc239790557"/>
       <w:r>
-        <w:t>1.1 Данные и предварительная проверка</w:t>
+        <w:t xml:space="preserve">1.1 Данные и предварительная </w:t>
+      </w:r>
+      <w:r>
+        <w:t>проверка</w:t>
       </w:r>
       <w:bookmarkEnd w:id="3"/>
     </w:p>
     <w:p>
       <w:r>
-        <w:t>Мы использовали 150 сообщений RuSentiment [1]. Основной репозиторий больше не распространяет корпус, поэтому данные получены из публичного форка strawberrypie/rusentiment. Ссылка, контрольная сумма ис</w:t>
+        <w:t>Я использовал 150 сообщений RuSentiment [1]. Основной репозиторий больше не распространяет корпус, поэтому данные получены из публичного форка strawberrypie/rusentiment. Ссылка, контрольная сумма исходного файла и процедура отбора сохранены. Выбор</w:t>
       </w:r>
       <w:r>
-        <w:t>ходного файла и процедура отбора сохранены. Выборка взята из обучающей части общей подготовки с random_state=42; оставлены positive, negative и neutral. Классы speech и skip исключены. Это трёхклассовый учебный срез, а не воспроизведение исходной пяти-клас</w:t>
-      </w:r>
-      <w:r>
-        <w:t>совой задачи статьи.</w:t>
+        <w:t>ка взята из обучающей части общей подготовки с random_state=42; оставлены positive, negative и neutral. Классы speech и skip исключены. Это трёхклассовый учебный срез, а не воспроизведение исходной пяти-классовой задачи статьи.</w:t>
       </w:r>
     </w:p>
     <w:p>
       <w:r>
-        <w:t>В выборке 82 нейтральных, 46 положительных и 22 отрицательных сообщения. Пропусков и повторяющихся текстов после подготовки нет. В полном исходном файле случайных сообщений обнаружено 74 дубликата; удаление выполнено до отбора. Средняя</w:t>
+        <w:t>В выборке 82 нейтральных, 46</w:t>
       </w:r>
       <w:r>
-        <w:t xml:space="preserve"> длина равна 69,81 символа, медиана — 40,5, максимум — 789. Для токенов razdel среднее составляет 14,47, медиана — 9, максимум — 154. Разница среднего и медианы отражает длинный правый хвост: небольшое число длинных сообщений заметно влияет на среднее.</w:t>
+        <w:t xml:space="preserve"> положительных и 22 отрицательных сообщения. Пропусков и повторяющихся текстов после подготовки нет. В полном исходном файле случайных сообщений обнаружено 74 дубликата; удаление выполнено до отбора. Средняя длина равна 69,81 символа, медиана — 40,5, макси</w:t>
+      </w:r>
+      <w:r>
+        <w:t>мум — 789. Для токенов razdel среднее составляет 14,47, медиана — 9, максимум — 154. Разница среднего и медианы отражает длинный правый хвост: небольшое число длинных сообщений заметно влияет на среднее.</w:t>
       </w:r>
     </w:p>
     <w:p>
@@ -1004,10 +991,7 @@
         <w:jc w:val="center"/>
       </w:pPr>
       <w:r>
-        <w:t>Р</w:t>
-      </w:r>
-      <w:r>
-        <w:t>исунок 1 — Распределение длин текстов</w:t>
+        <w:t>Рисунок 1 — Распределение длин текстов</w:t>
       </w:r>
     </w:p>
     <w:p>
@@ -1017,9 +1001,12 @@
         <w:spacing w:before="240" w:after="240"/>
         <w:jc w:val="left"/>
       </w:pPr>
-      <w:bookmarkStart w:id="4" w:name="_Toc239790087"/>
+      <w:bookmarkStart w:id="4" w:name="_Toc239790558"/>
       <w:r>
-        <w:t>1.2 Методика</w:t>
+        <w:t>1.2 Методик</w:t>
+      </w:r>
+      <w:r>
+        <w:t>а</w:t>
       </w:r>
       <w:bookmarkEnd w:id="4"/>
     </w:p>
@@ -1029,43 +1016,43 @@
       </w:r>
       <w:r>
         <w:lastRenderedPageBreak/>
-        <w:t>заглавных букв среди букв. Такие признаки описывают форму сообщения и могут</w:t>
+        <w:t xml:space="preserve">заглавных букв среди букв. Такие признаки описывают форму сообщения и могут отражать эмоциональную подачу, но не указывают, </w:t>
       </w:r>
       <w:r>
-        <w:t xml:space="preserve"> отражать эмоциональную подачу, но не указывают, о чём именно говорит автор. Например, два противоположных утверждения способны иметь почти одинаковую длину и пунктуацию. Все признаки сохранены построчно с исходными идентификаторами.</w:t>
+        <w:t>о чём именно говорит автор. Например, два противоположных утверждения способны иметь почти одинаковую длину и пунктуацию. Все признаки сохранены построчно с исходными идентификаторами.</w:t>
       </w:r>
     </w:p>
     <w:p>
       <w:r>
-        <w:t>Для bag-of-words и TF–</w:t>
+        <w:t>Для bag-of-words и TF–IDF я использовал CountVectorizer и TfidfVectoriz</w:t>
       </w:r>
       <w:r>
-        <w:t>IDF мы использовали CountVectorizer и TfidfVectorizer. Токенизация выполняется razdel, регистр понижается, чистая пунктуация исключается. Лемматизация и удаление стоп-слов не применяются: важно сохранить отрицание «не». Словарь и IDF обучаются только на 15</w:t>
+        <w:t>er. Токенизация выполняется razdel, регистр понижается, чистая пунктуация исключается. Лемматизация и удаление стоп-слов не применяются: важно сохранить отрицание «не». Словарь и IDF обучаются только на 150 исходных текстах. Изменённые варианты преобразуют</w:t>
       </w:r>
       <w:r>
-        <w:t>0 исходных текстах. Изменённые варианты преобразуются уже готовыми векторизаторами. Поэтому эксперимент также выявляет проблему неизвестных слов; доля OOV сохранена отдельно для каждой пары.</w:t>
+        <w:t>ся уже готовыми векторизаторами. Поэтому эксперимент также выявляет проблему неизвестных слов; доля OOV сохранена отдельно для каждой пары.</w:t>
       </w:r>
     </w:p>
     <w:p>
       <w:r>
-        <w:t>Плотное представление строится sentence-transformers с multilingu</w:t>
+        <w:t>Плотное представление строится sentence-transformers с multilingual-e5-small [2]. Для симметричного сравнения обе ст</w:t>
       </w:r>
       <w:r>
-        <w:t>al-e5-small [2]. Для симметричного сравнения обе стороны получают одинаковый префикс query:, векторы нормируются. Мы вычислили эмбеддинги на CPU, поэтому запуск работы не требует свободной видеокарты. Размерность и параметры модели записаны в embedding_con</w:t>
+        <w:t>ороны получают одинаковый префикс query:, векторы нормируются. Я вычислил эмбеддинги на CPU, поэтому запуск работы не требует свободной видеокарты. Размерность и параметры модели записаны в embedding_config.json. Для каждого преобразования я рассчитал коси</w:t>
       </w:r>
       <w:r>
-        <w:t>fig.json. Для каждого преобразования мы рассчитали косинусное сходство с оригиналом; всего получено девять пар. Поверхностные признаки не включены в косинусное сравнение: задание требует его для трёх остальных представлений.</w:t>
+        <w:t>нусное сходство с оригиналом; всего получено девять пар. Поверхностные признаки не включены в косинусное сравнение: задание требует его для трёх остальных представлений.</w:t>
       </w:r>
     </w:p>
     <w:p>
       <w:r>
-        <w:t>Мы выбрали оригиналы трёх класс</w:t>
+        <w:t>Я выбрал оригиналы трёх классов: положительное сообщение о спокойной песне, отрицатель</w:t>
       </w:r>
       <w:r>
-        <w:t>ов: положительное сообщение о спокойной песне, отрицательное сообщение о глупых репостах и нейтральный вопрос о времени выезда. При конструировании преобразований мы заранее сформулировали семантические решения и обоснования, чтобы затем сопоставить их с ч</w:t>
+        <w:t>ное сообщение о глупых репостах и нейтральный вопрос о времени выезда. При конструировании преобразований я заранее сформулировал семантические решения и обоснования, чтобы затем сопоставить их с численным сходством. Для парафраза вопроса сохраняется основ</w:t>
       </w:r>
       <w:r>
-        <w:t>исленным сходством. Для парафраза вопроса сохраняется основное содержание, хотя эмоциональный оттенок обращения немного ослабляется.</w:t>
+        <w:t>ное содержание, хотя эмоциональный оттенок обращения немного ослабляется.</w:t>
       </w:r>
     </w:p>
     <w:p>
@@ -1075,7 +1062,7 @@
         <w:spacing w:before="240" w:after="240"/>
         <w:jc w:val="left"/>
       </w:pPr>
-      <w:bookmarkStart w:id="5" w:name="_Toc239790088"/>
+      <w:bookmarkStart w:id="5" w:name="_Toc239790559"/>
       <w:r>
         <w:lastRenderedPageBreak/>
         <w:t>1.3 Результаты девяти сравнений</w:t>
@@ -1205,13 +1192,7 @@
               <w:rPr>
                 <w:sz w:val="24"/>
               </w:rPr>
-              <w:t xml:space="preserve">Positive: </w:t>
-            </w:r>
-            <w:r>
-              <w:rPr>
-                <w:sz w:val="24"/>
-              </w:rPr>
-              <w:t>перестановка</w:t>
+              <w:t>Positive: перестановка</w:t>
             </w:r>
           </w:p>
         </w:tc>
@@ -1673,13 +1654,7 @@
               <w:rPr>
                 <w:sz w:val="24"/>
               </w:rPr>
-              <w:t xml:space="preserve">Neutral: </w:t>
-            </w:r>
-            <w:r>
-              <w:rPr>
-                <w:sz w:val="24"/>
-              </w:rPr>
-              <w:t>перестановка</w:t>
+              <w:t>Neutral: перестановка</w:t>
             </w:r>
           </w:p>
         </w:tc>
@@ -1953,17 +1928,17 @@
     </w:p>
     <w:p>
       <w:r>
-        <w:t xml:space="preserve">Перестановка не меняет unigram-счётчики, поэтому обе разреженные модели возвращают ровно </w:t>
+        <w:t>Перестановка не меняет unigram-счётчики, поэтому обе разреженные модели возвращают ровно единицу. Этот результат следует из определения представления, а не доказывае</w:t>
       </w:r>
       <w:r>
-        <w:t xml:space="preserve">единицу. Этот результат следует из определения представления, а не доказывает языковое понимание. Эмбеддинги немного меняются, поскольку модель чувствительна к последовательности. Для </w:t>
+        <w:t xml:space="preserve">т языковое понимание. Эмбеддинги немного меняются, поскольку модель чувствительна к последовательности. Для </w:t>
       </w:r>
       <w:r>
         <w:lastRenderedPageBreak/>
-        <w:t>парафразов плотное представление существенно лучше сохраняет близость: з</w:t>
+        <w:t>парафразов плотное представление существенно лучше сохраняет близость: значения 0,892–0,930 против 0–0,577 у разреженных методов. Однако часть паден</w:t>
       </w:r>
       <w:r>
-        <w:t>начения 0,892–0,930 против 0–0,577 у разреженных методов. Однако часть падения BoW объясняется малым словарём и морфологическими различиями, а не только заменой смысла.</w:t>
+        <w:t>ия BoW объясняется малым словарём и морфологическими различиями, а не только заменой смысла.</w:t>
       </w:r>
     </w:p>
     <w:p>
@@ -1973,7 +1948,7 @@
         <w:spacing w:before="240" w:after="240"/>
         <w:jc w:val="left"/>
       </w:pPr>
-      <w:bookmarkStart w:id="6" w:name="_Toc239790089"/>
+      <w:bookmarkStart w:id="6" w:name="_Toc239790560"/>
       <w:r>
         <w:t>1.4 Три несоответствия близости и смысла</w:t>
       </w:r>
@@ -1981,32 +1956,32 @@
     </w:p>
     <w:p>
       <w:r>
-        <w:t>Первый случай: «Обожаю её» заменено на «Не обо</w:t>
+        <w:t xml:space="preserve">Первый случай: «Обожаю её» заменено на «Не обожаю её». Утверждение о восхищении отрицается, но TF–IDF даёт 0,974 и E5 — </w:t>
       </w:r>
       <w:r>
-        <w:t xml:space="preserve">жаю её». Утверждение о восхищении отрицается, но TF–IDF даёт 0,974 и E5 — 0,974. Почти весь словарь и тема песни сохранены; частое короткое отрицание мало меняет направление вектора. При этом новая фраза не обязательно означает ненависть: корректный вывод </w:t>
-      </w:r>
-      <w:r>
-        <w:t>ограничен отсутствием прежнего утверждения.</w:t>
+        <w:t>0,974. Почти весь словарь и тема песни сохранены; частое короткое отрицание мало меняет направление вектора. При этом новая фраза не обязательно означает ненависть: корректный вывод ограничен отсутствием прежнего утверждения.</w:t>
       </w:r>
     </w:p>
     <w:p>
       <w:r>
-        <w:t>Второй случай: «у тебя одни глупые репосты» превращается в «у тебя не одни глупые репосты». Меняется область отрицания и всеобщность оценки: допускаются другие публикации. BoW остаётся равным 0,943, TF–IDF — 0,97</w:t>
+        <w:t>Второй случай: «у тебя одни гл</w:t>
       </w:r>
       <w:r>
-        <w:t>9, E5 — 0,987. Плотная модель в этой паре даже менее чувствительна, чем простое счётное представление. Тематическая близость не позволяет восстановить логический квантор.</w:t>
+        <w:t>упые репосты» превращается в «у тебя не одни глупые репосты». Меняется область отрицания и всеобщность оценки: допускаются другие публикации. BoW остаётся равным 0,943, TF–IDF — 0,979, E5 — 0,987. Плотная модель в этой паре даже менее чувствительна, чем пр</w:t>
+      </w:r>
+      <w:r>
+        <w:t>остое счётное представление. Тематическая близость не позволяет восстановить логический квантор.</w:t>
       </w:r>
     </w:p>
     <w:p>
       <w:r>
-        <w:t>Третий случай: «Когда выезжаешь» заменено на «Когда приезжаешь». Оба сообщения относя</w:t>
+        <w:t>Третий случай: «Когда выезжаешь» заменено на «Когда приезжаешь». Оба сообщения относятся к поездке, но запрашивают разные события и обычно разные моменты време</w:t>
       </w:r>
       <w:r>
-        <w:t xml:space="preserve">тся к поездке, но запрашивают разные события и обычно разные моменты времени. E5 показывает 0,988 — больше, чем для смыслосохраняющего парафраза этого же вопроса. Разреженные методы замечают замену слова сильнее, однако сами не объясняют различие выезда и </w:t>
+        <w:t>ни. E5 показывает 0,988 — больше, чем для смыслосохраняющего парафраза этого же вопроса. Разреженные методы замечают замену слова сильнее, однако сами не объясняют различие выезда и прибытия. Следовательно, универсальный порог сходства не решает задачу экв</w:t>
       </w:r>
       <w:r>
-        <w:t>прибытия. Следовательно, универсальный порог сходства не решает задачу эквивалентности.</w:t>
+        <w:t>ивалентности.</w:t>
       </w:r>
     </w:p>
     <w:p>
@@ -2018,7 +1993,7 @@
         <w:ind w:firstLine="0"/>
         <w:jc w:val="center"/>
       </w:pPr>
-      <w:bookmarkStart w:id="7" w:name="_Toc239790090"/>
+      <w:bookmarkStart w:id="7" w:name="_Toc239790561"/>
       <w:r>
         <w:lastRenderedPageBreak/>
         <w:t>ЗАКЛЮЧЕНИЕ</w:t>
@@ -2027,13 +2002,13 @@
     </w:p>
     <w:p>
       <w:r>
-        <w:t>Поверхностные признаки сохраняют форму, BoW — лексический состав, TF–IDF — взвешенный лексический состав, E5 — более широкую тематическую и семантическую бли</w:t>
+        <w:t>Поверхностные признаки сохраняют форму, BoW — лексический состав, TF–IDF — взвешенный лексический состав, E5 — более широкую тематическую и семантическую близость. Плотные векторы полезнее для перефразирования, но могут игнорироват</w:t>
       </w:r>
       <w:r>
-        <w:t>зость. Плотные векторы полезнее для перефразирования, но могут игнорировать отрицание и замену события. Девять специально выбранных пар иллюстрируют механизм ошибки, а не оценивают её частоту в языке. Для задач, где важны противоположные утверждения, после</w:t>
+        <w:t>ь отрицание и замену события. Девять специально выбранных пар иллюстрируют механизм ошибки, а не оценивают её частоту в языке. Для задач, где важны противоположные утверждения, после поиска похожих текстов необходима отдельная проверка содержания. Я послед</w:t>
       </w:r>
       <w:r>
-        <w:t xml:space="preserve"> поиска похожих текстов необходима отдельная проверка содержания. Мы последовательно выполнили notebook; исходные данные, преобразования, матрицы, графики и таблицы сохранены для повторного запуска.</w:t>
+        <w:t>овательно выполнил notebook; исходные данные, преобразования, матрицы, графики и таблицы сохранены для повторного запуска.</w:t>
       </w:r>
     </w:p>
     <w:p>
@@ -2045,7 +2020,7 @@
         <w:ind w:firstLine="0"/>
         <w:jc w:val="center"/>
       </w:pPr>
-      <w:bookmarkStart w:id="8" w:name="_Toc239790091"/>
+      <w:bookmarkStart w:id="8" w:name="_Toc239790562"/>
       <w:r>
         <w:lastRenderedPageBreak/>
         <w:t>СПИСОК ИСПОЛЬЗОВАННЫХ ИСТОЧНИКОВ</w:t>
@@ -2054,18 +2029,18 @@
     </w:p>
     <w:p>
       <w:r>
-        <w:t>[1] Rogers A. et al. RuS</w:t>
+        <w:t>[1] Rogers A. et al. RuSentiment: An Enriched Sentiment Analysis Dataset for Social Media in Russian</w:t>
       </w:r>
       <w:r>
-        <w:t>entiment: An Enriched Sentiment Analysis Dataset for Social Media in Russian. COLING, 2018. URL: https://aclanthology.org/C18-1064/ (дата обращения: 08.09.2026). Данные: https://github.com/strawberrypie/rusentiment.</w:t>
+        <w:t>. COLING, 2018. URL: https://aclanthology.org/C18-1064/ (дата обращения: 08.09.2026). Данные: https://github.com/strawberrypie/rusentiment.</w:t>
       </w:r>
     </w:p>
     <w:p>
       <w:r>
-        <w:t>[2] intfloat. Multilingual E5 small: mod</w:t>
+        <w:t>[2] intfloat. Multilingual E5 small: model card. URL: https://huggingface.co/intfloat/multilingual-e5-small (дата об</w:t>
       </w:r>
       <w:r>
-        <w:t>el card. URL: https://huggingface.co/intfloat/multilingual-e5-small (дата обращения: 08.09.2026).</w:t>
+        <w:t>ращения: 08.09.2026).</w:t>
       </w:r>
     </w:p>
     <w:sectPr>
@@ -14125,7 +14100,7 @@
 </file>
 
 <file path=customXml/itemProps1.xml><?xml version="1.0" encoding="utf-8"?>
-<ds:datastoreItem xmlns:ds="http://schemas.openxmlformats.org/officeDocument/2006/customXml" ds:itemID="{37525F05-8562-463B-A3E5-0CE62F3DF254}">
+<ds:datastoreItem xmlns:ds="http://schemas.openxmlformats.org/officeDocument/2006/customXml" ds:itemID="{E1AB556A-BC05-403F-9153-25400C5BA8A9}">
   <ds:schemaRefs>
     <ds:schemaRef ds:uri="http://schemas.openxmlformats.org/officeDocument/2006/bibliography"/>
   </ds:schemaRefs>

</xml_diff>